<commit_message>
Update preprocessing to run from scratch, retrain classifiers, and regenerate updated Paper_ICPU docx/pdf
</commit_message>
<xml_diff>
--- a/Documents/Paper_ICPU.docx
+++ b/Documents/Paper_ICPU.docx
@@ -90,7 +90,7 @@
           <w:rFonts w:ascii="Times New Roman" w:hAnsi="Times New Roman"/>
           <w:sz w:val="20"/>
         </w:rPr>
-        <w:t>Stroke is the second leading cause of global mortality, necessitating robust early-risk screening. Traditional stroke prediction pipelines suffer from: (1) data leakage from multi-visit duplicate records that artificially inflate validation accuracy, and (2) absence of behavioral biomarkers such as physical activity in clinical datasets. This paper presents an integrated machine learning framework that collapses 143,960 clinical visit rows into 5,110 unique patient profiles via patient-level deduplication, trains an XGBoost Regressor on an auxiliary 15,000-record physical-activity dataset to synthesize each patient's estimated energy expenditure as a surrogate behavioral biomarker, and compares six candidate classifiers under validation-set F1-optimized decision thresholds. Stacking Calibrated Sigmoid achieves a recall of 92.11% and an AUC-ROC of 0.8622 on the held-out patient test set, minimizing missed diagnoses. SHAP analysis confirms age and average glucose level as dominant predictors, while estimated calories provides an independent behavioral signal. The pipeline is transpiled into a zero-dependency C++ binary for low-latency clinical edge deployment.</w:t>
+        <w:t>Stroke is the second leading cause of global mortality, necessitating robust early-risk screening. Traditional stroke prediction pipelines suffer from: (1) data leakage from multi-visit duplicate records that artificially inflate validation accuracy, and (2) absence of behavioral biomarkers such as physical activity in clinical datasets. This paper presents an integrated machine learning framework that collapses 143,960 clinical visit rows into 5,110 unique patient profiles via patient-level deduplication, trains an XGBoost Regressor on an auxiliary 15,000-record physical-activity dataset to synthesize each patient's estimated energy expenditure as a surrogate behavioral biomarker, and compares six candidate classifiers under validation-set F1-optimized decision thresholds. Stacking Calibrated Sigmoid achieves a recall of 92.11% and an AUC-ROC of 0.8544 on the held-out patient test set, minimizing missed diagnoses. SHAP analysis confirms age and average glucose level as dominant predictors, while estimated calories provides an independent behavioral signal. The pipeline is transpiled into a zero-dependency C++ binary for low-latency clinical edge deployment.</w:t>
       </w:r>
       <w:r>
         <w:br/>
@@ -267,7 +267,7 @@
           <w:rFonts w:ascii="Times New Roman" w:hAnsi="Times New Roman"/>
           <w:sz w:val="22"/>
         </w:rPr>
-        <w:t>A systematic comparison showing Stacking Calibrated Sigmoid achieves a recall of 92.11% with an AUC-ROC of 0.8622.</w:t>
+        <w:t>A systematic comparison showing Stacking Calibrated Sigmoid achieves a recall of 92.11% with an AUC-ROC of 0.8544.</w:t>
       </w:r>
     </w:p>
     <w:p>
@@ -1149,7 +1149,7 @@
                 <w:b/>
                 <w:sz w:val="16"/>
               </w:rPr>
-              <w:t>Stacking (Sigmoid)</w:t>
+              <w:t>XGBoost</w:t>
             </w:r>
           </w:p>
         </w:tc>
@@ -1182,7 +1182,7 @@
                 <w:b/>
                 <w:sz w:val="16"/>
               </w:rPr>
-              <w:t>0.040</w:t>
+              <w:t>0.645</w:t>
             </w:r>
           </w:p>
         </w:tc>
@@ -1215,7 +1215,7 @@
                 <w:b/>
                 <w:sz w:val="16"/>
               </w:rPr>
-              <w:t>71.2%</w:t>
+              <w:t>84.2%</w:t>
             </w:r>
           </w:p>
         </w:tc>
@@ -1248,7 +1248,7 @@
                 <w:b/>
                 <w:sz w:val="16"/>
               </w:rPr>
-              <w:t>13.8%</w:t>
+              <w:t>19.3%</w:t>
             </w:r>
           </w:p>
         </w:tc>
@@ -1281,7 +1281,7 @@
                 <w:b/>
                 <w:sz w:val="16"/>
               </w:rPr>
-              <w:t>92.1%</w:t>
+              <w:t>68.4%</w:t>
             </w:r>
           </w:p>
         </w:tc>
@@ -1314,7 +1314,7 @@
                 <w:b/>
                 <w:sz w:val="16"/>
               </w:rPr>
-              <w:t>0.241</w:t>
+              <w:t>0.301</w:t>
             </w:r>
           </w:p>
         </w:tc>
@@ -1347,7 +1347,7 @@
                 <w:b/>
                 <w:sz w:val="16"/>
               </w:rPr>
-              <w:t>0.862</w:t>
+              <w:t>0.859</w:t>
             </w:r>
           </w:p>
         </w:tc>
@@ -1382,7 +1382,7 @@
                 <w:b w:val="0"/>
                 <w:sz w:val="16"/>
               </w:rPr>
-              <w:t>XGBoost</w:t>
+              <w:t>Grad. Boost.</w:t>
             </w:r>
           </w:p>
         </w:tc>
@@ -1415,7 +1415,7 @@
                 <w:b w:val="0"/>
                 <w:sz w:val="16"/>
               </w:rPr>
-              <w:t>0.400</w:t>
+              <w:t>0.095</w:t>
             </w:r>
           </w:p>
         </w:tc>
@@ -1448,7 +1448,7 @@
                 <w:b w:val="0"/>
                 <w:sz w:val="16"/>
               </w:rPr>
-              <w:t>61.9%</w:t>
+              <w:t>84.7%</w:t>
             </w:r>
           </w:p>
         </w:tc>
@@ -1481,7 +1481,7 @@
                 <w:b w:val="0"/>
                 <w:sz w:val="16"/>
               </w:rPr>
-              <w:t>11.0%</w:t>
+              <w:t>19.4%</w:t>
             </w:r>
           </w:p>
         </w:tc>
@@ -1514,7 +1514,7 @@
                 <w:b w:val="0"/>
                 <w:sz w:val="16"/>
               </w:rPr>
-              <w:t>94.7%</w:t>
+              <w:t>65.8%</w:t>
             </w:r>
           </w:p>
         </w:tc>
@@ -1547,7 +1547,7 @@
                 <w:b w:val="0"/>
                 <w:sz w:val="16"/>
               </w:rPr>
-              <w:t>0.198</w:t>
+              <w:t>0.299</w:t>
             </w:r>
           </w:p>
         </w:tc>
@@ -1580,7 +1580,7 @@
                 <w:b w:val="0"/>
                 <w:sz w:val="16"/>
               </w:rPr>
-              <w:t>0.868</w:t>
+              <w:t>0.860</w:t>
             </w:r>
           </w:p>
         </w:tc>
@@ -1615,7 +1615,7 @@
                 <w:b w:val="0"/>
                 <w:sz w:val="16"/>
               </w:rPr>
-              <w:t>Grad. Boost.</w:t>
+              <w:t>Log. Reg.</w:t>
             </w:r>
           </w:p>
         </w:tc>
@@ -1648,7 +1648,7 @@
                 <w:b w:val="0"/>
                 <w:sz w:val="16"/>
               </w:rPr>
-              <w:t>0.030</w:t>
+              <w:t>0.670</w:t>
             </w:r>
           </w:p>
         </w:tc>
@@ -1681,7 +1681,7 @@
                 <w:b w:val="0"/>
                 <w:sz w:val="16"/>
               </w:rPr>
-              <w:t>66.4%</w:t>
+              <w:t>83.8%</w:t>
             </w:r>
           </w:p>
         </w:tc>
@@ -1714,7 +1714,7 @@
                 <w:b w:val="0"/>
                 <w:sz w:val="16"/>
               </w:rPr>
-              <w:t>11.8%</w:t>
+              <w:t>18.4%</w:t>
             </w:r>
           </w:p>
         </w:tc>
@@ -1747,7 +1747,7 @@
                 <w:b w:val="0"/>
                 <w:sz w:val="16"/>
               </w:rPr>
-              <w:t>89.5%</w:t>
+              <w:t>65.8%</w:t>
             </w:r>
           </w:p>
         </w:tc>
@@ -1780,7 +1780,7 @@
                 <w:b w:val="0"/>
                 <w:sz w:val="16"/>
               </w:rPr>
-              <w:t>0.209</w:t>
+              <w:t>0.287</w:t>
             </w:r>
           </w:p>
         </w:tc>
@@ -1813,7 +1813,7 @@
                 <w:b w:val="0"/>
                 <w:sz w:val="16"/>
               </w:rPr>
-              <w:t>0.854</w:t>
+              <w:t>0.850</w:t>
             </w:r>
           </w:p>
         </w:tc>
@@ -1881,7 +1881,7 @@
                 <w:b w:val="0"/>
                 <w:sz w:val="16"/>
               </w:rPr>
-              <w:t>0.420</w:t>
+              <w:t>0.575</w:t>
             </w:r>
           </w:p>
         </w:tc>
@@ -1914,7 +1914,7 @@
                 <w:b w:val="0"/>
                 <w:sz w:val="16"/>
               </w:rPr>
-              <w:t>59.1%</w:t>
+              <w:t>80.7%</w:t>
             </w:r>
           </w:p>
         </w:tc>
@@ -1947,7 +1947,7 @@
                 <w:b w:val="0"/>
                 <w:sz w:val="16"/>
               </w:rPr>
-              <w:t>10.3%</w:t>
+              <w:t>16.9%</w:t>
             </w:r>
           </w:p>
         </w:tc>
@@ -1980,7 +1980,7 @@
                 <w:b w:val="0"/>
                 <w:sz w:val="16"/>
               </w:rPr>
-              <w:t>94.7%</w:t>
+              <w:t>73.7%</w:t>
             </w:r>
           </w:p>
         </w:tc>
@@ -2013,7 +2013,7 @@
                 <w:b w:val="0"/>
                 <w:sz w:val="16"/>
               </w:rPr>
-              <w:t>0.187</w:t>
+              <w:t>0.275</w:t>
             </w:r>
           </w:p>
         </w:tc>
@@ -2046,7 +2046,7 @@
                 <w:b w:val="0"/>
                 <w:sz w:val="16"/>
               </w:rPr>
-              <w:t>0.852</w:t>
+              <w:t>0.850</w:t>
             </w:r>
           </w:p>
         </w:tc>
@@ -2081,7 +2081,7 @@
                 <w:b w:val="0"/>
                 <w:sz w:val="16"/>
               </w:rPr>
-              <w:t>Log. Reg.</w:t>
+              <w:t>Rand. Forest</w:t>
             </w:r>
           </w:p>
         </w:tc>
@@ -2114,7 +2114,7 @@
                 <w:b w:val="0"/>
                 <w:sz w:val="16"/>
               </w:rPr>
-              <w:t>0.040</w:t>
+              <w:t>0.545</w:t>
             </w:r>
           </w:p>
         </w:tc>
@@ -2147,7 +2147,7 @@
                 <w:b w:val="0"/>
                 <w:sz w:val="16"/>
               </w:rPr>
-              <w:t>70.4%</w:t>
+              <w:t>78.1%</w:t>
             </w:r>
           </w:p>
         </w:tc>
@@ -2180,7 +2180,7 @@
                 <w:b w:val="0"/>
                 <w:sz w:val="16"/>
               </w:rPr>
-              <w:t>13.5%</w:t>
+              <w:t>15.4%</w:t>
             </w:r>
           </w:p>
         </w:tc>
@@ -2213,7 +2213,7 @@
                 <w:b w:val="0"/>
                 <w:sz w:val="16"/>
               </w:rPr>
-              <w:t>92.1%</w:t>
+              <w:t>76.3%</w:t>
             </w:r>
           </w:p>
         </w:tc>
@@ -2246,7 +2246,7 @@
                 <w:b w:val="0"/>
                 <w:sz w:val="16"/>
               </w:rPr>
-              <w:t>0.236</w:t>
+              <w:t>0.257</w:t>
             </w:r>
           </w:p>
         </w:tc>
@@ -2279,7 +2279,7 @@
                 <w:b w:val="0"/>
                 <w:sz w:val="16"/>
               </w:rPr>
-              <w:t>0.855</w:t>
+              <w:t>0.845</w:t>
             </w:r>
           </w:p>
         </w:tc>
@@ -2347,7 +2347,7 @@
                 <w:b w:val="0"/>
                 <w:sz w:val="16"/>
               </w:rPr>
-              <w:t>0.230</w:t>
+              <w:t>0.625</w:t>
             </w:r>
           </w:p>
         </w:tc>
@@ -2380,7 +2380,7 @@
                 <w:b w:val="0"/>
                 <w:sz w:val="16"/>
               </w:rPr>
-              <w:t>61.9%</w:t>
+              <w:t>83.3%</w:t>
             </w:r>
           </w:p>
         </w:tc>
@@ -2413,7 +2413,7 @@
                 <w:b w:val="0"/>
                 <w:sz w:val="16"/>
               </w:rPr>
-              <w:t>10.6%</w:t>
+              <w:t>15.4%</w:t>
             </w:r>
           </w:p>
         </w:tc>
@@ -2446,7 +2446,7 @@
                 <w:b w:val="0"/>
                 <w:sz w:val="16"/>
               </w:rPr>
-              <w:t>89.5%</w:t>
+              <w:t>52.6%</w:t>
             </w:r>
           </w:p>
         </w:tc>
@@ -2479,7 +2479,7 @@
                 <w:b w:val="0"/>
                 <w:sz w:val="16"/>
               </w:rPr>
-              <w:t>0.189</w:t>
+              <w:t>0.238</w:t>
             </w:r>
           </w:p>
         </w:tc>
@@ -2547,7 +2547,7 @@
                 <w:b w:val="0"/>
                 <w:sz w:val="16"/>
               </w:rPr>
-              <w:t>Rand. Forest</w:t>
+              <w:t>Stacking (Sigmoid)</w:t>
             </w:r>
           </w:p>
         </w:tc>
@@ -2580,7 +2580,7 @@
                 <w:b w:val="0"/>
                 <w:sz w:val="16"/>
               </w:rPr>
-              <w:t>0.370</w:t>
+              <w:t>0.030</w:t>
             </w:r>
           </w:p>
         </w:tc>
@@ -2613,7 +2613,7 @@
                 <w:b w:val="0"/>
                 <w:sz w:val="16"/>
               </w:rPr>
-              <w:t>65.7%</w:t>
+              <w:t>66.4%</w:t>
             </w:r>
           </w:p>
         </w:tc>
@@ -2646,7 +2646,7 @@
                 <w:b w:val="0"/>
                 <w:sz w:val="16"/>
               </w:rPr>
-              <w:t>11.9%</w:t>
+              <w:t>12.1%</w:t>
             </w:r>
           </w:p>
         </w:tc>
@@ -2712,7 +2712,7 @@
                 <w:b w:val="0"/>
                 <w:sz w:val="16"/>
               </w:rPr>
-              <w:t>0.210</w:t>
+              <w:t>0.213</w:t>
             </w:r>
           </w:p>
         </w:tc>
@@ -2745,7 +2745,7 @@
                 <w:b w:val="0"/>
                 <w:sz w:val="16"/>
               </w:rPr>
-              <w:t>0.863</w:t>
+              <w:t>0.854</w:t>
             </w:r>
           </w:p>
         </w:tc>
@@ -2825,7 +2825,7 @@
               <a:graphicData uri="http://schemas.openxmlformats.org/drawingml/2006/picture">
                 <pic:pic>
                   <pic:nvPicPr>
-                    <pic:cNvPr id="0" name="roc_curves.png"/>
+                    <pic:cNvPr id="0" name="image.png"/>
                     <pic:cNvPicPr/>
                   </pic:nvPicPr>
                   <pic:blipFill>
@@ -2892,7 +2892,7 @@
       <w:r>
         <w:drawing>
           <wp:inline xmlns:a="http://schemas.openxmlformats.org/drawingml/2006/main" xmlns:pic="http://schemas.openxmlformats.org/drawingml/2006/picture">
-            <wp:extent cx="2286000" cy="3436337"/>
+            <wp:extent cx="2286000" cy="3431932"/>
             <wp:docPr id="2" name="Picture 2"/>
             <wp:cNvGraphicFramePr>
               <a:graphicFrameLocks noChangeAspect="1"/>
@@ -2905,7 +2905,7 @@
                     <pic:cNvPicPr/>
                   </pic:nvPicPr>
                   <pic:blipFill>
-                    <a:blip r:embed="rId16"/>
+                    <a:blip r:embed="rId17"/>
                     <a:stretch>
                       <a:fillRect/>
                     </a:stretch>
@@ -2913,7 +2913,7 @@
                   <pic:spPr>
                     <a:xfrm>
                       <a:off x="0" y="0"/>
-                      <a:ext cx="2286000" cy="3436337"/>
+                      <a:ext cx="2286000" cy="3431932"/>
                     </a:xfrm>
                     <a:prstGeom prst="rect"/>
                   </pic:spPr>
@@ -4672,7 +4672,7 @@
           <w:i w:val="0"/>
           <w:sz w:val="22"/>
         </w:rPr>
-        <w:t>Among candidate classifiers, Stacking Calibrated Sigmoid achieves a recall of 92.11% and an AUC-ROC of 0.8622 after threshold optimization. SHAP analysis confirms age and glucose as dominant predictors, with estimated calories contributing an independent behavioral signal.</w:t>
+        <w:t>Among candidate classifiers, Stacking Calibrated Sigmoid achieves a recall of 92.11% and an AUC-ROC of 0.8544 after threshold optimization. SHAP analysis confirms age and glucose as dominant predictors, with estimated calories contributing an independent behavioral signal.</w:t>
       </w:r>
     </w:p>
     <w:p>

</xml_diff>

<commit_message>
Update .gitignore to ignore all in Documents except Paper_ICPU.docx, and add remove_names.py script
</commit_message>
<xml_diff>
--- a/Documents/Paper_ICPU.docx
+++ b/Documents/Paper_ICPU.docx
@@ -10,66 +10,6 @@
       <w:r/>
       <w:r>
         <w:t>An Integrated Multi-Source Machine Learning Framework for Stroke Risk Prediction with Synthetic Energy Expenditure Estimation</w:t>
-      </w:r>
-    </w:p>
-    <w:p>
-      <w:pPr>
-        <w:pStyle w:val="AuthorLastName"/>
-        <w:rPr>
-          <w:iCs/>
-        </w:rPr>
-      </w:pPr>
-      <w:r/>
-      <w:r>
-        <w:t>Nguyen Nhat Bang</w:t>
-      </w:r>
-      <w:r>
-        <w:rPr>
-          <w:vertAlign w:val="superscript"/>
-        </w:rPr>
-        <w:t>1</w:t>
-      </w:r>
-      <w:r>
-        <w:t>, Doan Minh Tuan</w:t>
-      </w:r>
-      <w:r>
-        <w:rPr>
-          <w:vertAlign w:val="superscript"/>
-        </w:rPr>
-        <w:t>1</w:t>
-      </w:r>
-      <w:r>
-        <w:t>, Ta Duy Anh</w:t>
-      </w:r>
-      <w:r>
-        <w:rPr>
-          <w:vertAlign w:val="superscript"/>
-        </w:rPr>
-        <w:t>1</w:t>
-      </w:r>
-      <w:r>
-        <w:t>, and Cao Van Mai</w:t>
-      </w:r>
-      <w:r>
-        <w:rPr>
-          <w:vertAlign w:val="superscript"/>
-        </w:rPr>
-        <w:t>1</w:t>
-      </w:r>
-    </w:p>
-    <w:p>
-      <w:pPr>
-        <w:pStyle w:val="Affiliation"/>
-      </w:pPr>
-      <w:r/>
-      <w:r>
-        <w:rPr>
-          <w:vertAlign w:val="superscript"/>
-        </w:rPr>
-        <w:t>1</w:t>
-      </w:r>
-      <w:r>
-        <w:t xml:space="preserve"> FPT University, Hanoi, Vietnam</w:t>
       </w:r>
     </w:p>
     <w:p>

</xml_diff>